<commit_message>
Fix lead timestamp bug and make dealer console mobile-responsive
</commit_message>
<xml_diff>
--- a/HANDOVER.docx
+++ b/HANDOVER.docx
@@ -501,6 +501,115 @@
       <w:r>
         <w:t>Your developer has set up automatic backups of your car listings and customer enquiries. Ask them to confirm backups are running and where they're stored, and to occasionally show you that a backup can actually be restored.</w:t>
       </w:r>
+      <w:r>
+        <w:br w:type="textWrapping"/>
+      </w:r>
+      <w:r>
+        <w:br w:type="textWrapping"/>
+      </w:r>
+    </w:p>
+    <w:p>
+      <w:pPr>
+        <w:spacing w:after="160"/>
+      </w:pPr>
+      <w:r>
+        <w:rPr>
+          <w:rFonts w:hint="default"/>
+          <w:color w:val="558ED5" w:themeColor="text2" w:themeTint="99"/>
+          <w:lang w:val="en-US"/>
+          <w14:textFill>
+            <w14:solidFill>
+              <w14:schemeClr w14:val="tx2">
+                <w14:lumMod w14:val="60000"/>
+                <w14:lumOff w14:val="40000"/>
+              </w14:schemeClr>
+            </w14:solidFill>
+          </w14:textFill>
+        </w:rPr>
+        <w:t>***</w:t>
+      </w:r>
+      <w:r>
+        <w:rPr>
+          <w:rFonts w:hint="default"/>
+          <w:lang w:val="en-US"/>
+        </w:rPr>
+        <w:t xml:space="preserve"> </w:t>
+      </w:r>
+      <w:r>
+        <w:rPr>
+          <w:color w:val="558ED5" w:themeColor="text2" w:themeTint="99"/>
+          <w:sz w:val="32"/>
+          <w:szCs w:val="32"/>
+          <w14:textFill>
+            <w14:solidFill>
+              <w14:schemeClr w14:val="tx2">
+                <w14:lumMod w14:val="60000"/>
+                <w14:lumOff w14:val="40000"/>
+              </w14:schemeClr>
+            </w14:solidFill>
+          </w14:textFill>
+        </w:rPr>
+        <w:t>Your backups</w:t>
+      </w:r>
+      <w:r>
+        <w:rPr>
+          <w:color w:val="558ED5" w:themeColor="text2" w:themeTint="99"/>
+          <w:sz w:val="32"/>
+          <w:szCs w:val="32"/>
+          <w14:textFill>
+            <w14:solidFill>
+              <w14:schemeClr w14:val="tx2">
+                <w14:lumMod w14:val="60000"/>
+                <w14:lumOff w14:val="40000"/>
+              </w14:schemeClr>
+            </w14:solidFill>
+          </w14:textFill>
+        </w:rPr>
+        <w:br w:type="textWrapping"/>
+      </w:r>
+      <w:r>
+        <w:rPr>
+          <w:color w:val="558ED5" w:themeColor="text2" w:themeTint="99"/>
+          <w:sz w:val="32"/>
+          <w:szCs w:val="32"/>
+          <w14:textFill>
+            <w14:solidFill>
+              <w14:schemeClr w14:val="tx2">
+                <w14:lumMod w14:val="60000"/>
+                <w14:lumOff w14:val="40000"/>
+              </w14:schemeClr>
+            </w14:solidFill>
+          </w14:textFill>
+        </w:rPr>
+        <w:br w:type="textWrapping"/>
+      </w:r>
+      <w:r>
+        <w:t>Your car listings and customer enquiries are backed up automatically once a day (currently scheduled for 5:13 PM), and stored on a drive separate from the live website — not just sitting next to it. This isn't just switched on and forgotten either: a backup was actually tested by fully restoring it into a completely separate, isolated copy of the database and confirming every car came back correctly, so this has been proven to work, not just assumed to.</w:t>
+      </w:r>
+    </w:p>
+    <w:p>
+      <w:pPr>
+        <w:spacing w:after="160"/>
+      </w:pPr>
+      <w:r>
+        <w:rPr>
+          <w:i/>
+          <w:iCs/>
+        </w:rPr>
+        <w:t>One thing worth knowing honestly: right now, this daily backup runs from your developer's own computer using a scheduled task on Windows. That means it depends on that computer being switched on and your developer maintaining it — it is not something you can run yourself today, and it would stop if that arrangement ever changed. If you'd like backups that don't depend on any single person's computer — for example if you bring on a different developer later, or just want full independence — ask about moving this to a cloud-based schedule instead. It's a reasonable upgrade to make at some point, not an urgent problem.</w:t>
+      </w:r>
+    </w:p>
+    <w:p>
+      <w:pPr>
+        <w:pStyle w:val="16"/>
+        <w:numPr>
+          <w:numId w:val="0"/>
+        </w:numPr>
+        <w:spacing w:after="80"/>
+        <w:ind w:left="315" w:hanging="315" w:hangingChars="150"/>
+      </w:pPr>
+      <w:bookmarkStart w:id="0" w:name="_GoBack"/>
+      <w:bookmarkEnd w:id="0"/>
     </w:p>
     <w:p>
       <w:pPr>
@@ -648,16 +757,7 @@
                 <w:rFonts w:hint="default"/>
                 <w:lang w:val="en-US"/>
               </w:rPr>
-              <w:t>SEND ME A EMAIL (SUB: Issue in[ your website url</w:t>
-            </w:r>
-            <w:bookmarkStart w:id="0" w:name="_GoBack"/>
-            <w:bookmarkEnd w:id="0"/>
-            <w:r>
-              <w:rPr>
-                <w:rFonts w:hint="default"/>
-                <w:lang w:val="en-US"/>
-              </w:rPr>
-              <w:t xml:space="preserve"> ]</w:t>
+              <w:t>SEND ME A EMAIL (SUB: Issue in[ your website url ]</w:t>
             </w:r>
           </w:p>
         </w:tc>
@@ -1408,6 +1508,7 @@
     <w:qFormat/>
     <w:uiPriority w:val="0"/>
     <w:rPr>
+      <w:rFonts w:asciiTheme="minorHAnsi" w:hAnsiTheme="minorHAnsi" w:eastAsiaTheme="minorEastAsia" w:cstheme="minorBidi"/>
       <w:sz w:val="21"/>
       <w:szCs w:val="22"/>
     </w:rPr>
@@ -1418,6 +1519,7 @@
     <w:qFormat/>
     <w:uiPriority w:val="0"/>
     <w:rPr>
+      <w:rFonts w:asciiTheme="minorHAnsi" w:hAnsiTheme="minorHAnsi" w:eastAsiaTheme="minorEastAsia" w:cstheme="minorBidi"/>
       <w:color w:val="2E74B5"/>
       <w:sz w:val="32"/>
       <w:szCs w:val="32"/>
@@ -1429,6 +1531,7 @@
     <w:qFormat/>
     <w:uiPriority w:val="0"/>
     <w:rPr>
+      <w:rFonts w:asciiTheme="minorHAnsi" w:hAnsiTheme="minorHAnsi" w:eastAsiaTheme="minorEastAsia" w:cstheme="minorBidi"/>
       <w:color w:val="2E74B5"/>
       <w:sz w:val="26"/>
       <w:szCs w:val="26"/>
@@ -1440,6 +1543,7 @@
     <w:qFormat/>
     <w:uiPriority w:val="0"/>
     <w:rPr>
+      <w:rFonts w:asciiTheme="minorHAnsi" w:hAnsiTheme="minorHAnsi" w:eastAsiaTheme="minorEastAsia" w:cstheme="minorBidi"/>
       <w:color w:val="1F4D78"/>
       <w:sz w:val="24"/>
       <w:szCs w:val="24"/>
@@ -1451,6 +1555,7 @@
     <w:qFormat/>
     <w:uiPriority w:val="0"/>
     <w:rPr>
+      <w:rFonts w:asciiTheme="minorHAnsi" w:hAnsiTheme="minorHAnsi" w:eastAsiaTheme="minorEastAsia" w:cstheme="minorBidi"/>
       <w:i/>
       <w:iCs/>
       <w:color w:val="2E74B5"/>
@@ -1464,6 +1569,7 @@
     <w:qFormat/>
     <w:uiPriority w:val="0"/>
     <w:rPr>
+      <w:rFonts w:asciiTheme="minorHAnsi" w:hAnsiTheme="minorHAnsi" w:eastAsiaTheme="minorEastAsia" w:cstheme="minorBidi"/>
       <w:color w:val="2E74B5"/>
       <w:sz w:val="21"/>
       <w:szCs w:val="22"/>
@@ -1475,6 +1581,7 @@
     <w:qFormat/>
     <w:uiPriority w:val="0"/>
     <w:rPr>
+      <w:rFonts w:asciiTheme="minorHAnsi" w:hAnsiTheme="minorHAnsi" w:eastAsiaTheme="minorEastAsia" w:cstheme="minorBidi"/>
       <w:color w:val="1F4D78"/>
       <w:sz w:val="21"/>
       <w:szCs w:val="22"/>
@@ -1520,6 +1627,7 @@
       <w:spacing w:after="0" w:line="240" w:lineRule="auto"/>
     </w:pPr>
     <w:rPr>
+      <w:rFonts w:asciiTheme="minorHAnsi" w:hAnsiTheme="minorHAnsi" w:eastAsiaTheme="minorEastAsia" w:cstheme="minorBidi"/>
       <w:sz w:val="20"/>
       <w:szCs w:val="20"/>
     </w:rPr>
@@ -1544,6 +1652,7 @@
       <w:spacing w:after="0" w:line="240" w:lineRule="auto"/>
     </w:pPr>
     <w:rPr>
+      <w:rFonts w:asciiTheme="minorHAnsi" w:hAnsiTheme="minorHAnsi" w:eastAsiaTheme="minorEastAsia" w:cstheme="minorBidi"/>
       <w:sz w:val="20"/>
       <w:szCs w:val="20"/>
     </w:rPr>
@@ -1563,6 +1672,7 @@
     <w:qFormat/>
     <w:uiPriority w:val="0"/>
     <w:rPr>
+      <w:rFonts w:asciiTheme="minorHAnsi" w:hAnsiTheme="minorHAnsi" w:eastAsiaTheme="minorEastAsia" w:cstheme="minorBidi"/>
       <w:sz w:val="56"/>
       <w:szCs w:val="56"/>
     </w:rPr>
@@ -1572,6 +1682,7 @@
     <w:qFormat/>
     <w:uiPriority w:val="0"/>
     <w:rPr>
+      <w:rFonts w:asciiTheme="minorHAnsi" w:hAnsiTheme="minorHAnsi" w:eastAsiaTheme="minorEastAsia" w:cstheme="minorBidi"/>
       <w:sz w:val="21"/>
       <w:szCs w:val="22"/>
     </w:rPr>

</xml_diff>